<commit_message>
docs(spec): define component contracts & WBS table
</commit_message>
<xml_diff>
--- a/Lab 1 - Web Application Development 2026/242520963_NguyenHaLinh_Lab1_Exercise.docx
+++ b/Lab 1 - Web Application Development 2026/242520963_NguyenHaLinh_Lab1_Exercise.docx
@@ -435,6 +435,851 @@
         <w:tblLook w:val="04A0" w:firstRow="1" w:lastRow="0" w:firstColumn="1" w:lastColumn="0" w:noHBand="0" w:noVBand="1"/>
       </w:tblPr>
       <w:tblGrid>
+        <w:gridCol w:w="4904"/>
+        <w:gridCol w:w="4914"/>
+      </w:tblGrid>
+      <w:tr>
+        <w:tc>
+          <w:tcPr>
+            <w:tcW w:w="4968" w:type="dxa"/>
+          </w:tcPr>
+          <w:p>
+            <w:pPr>
+              <w:rPr>
+                <w:rFonts w:ascii="Lora" w:hAnsi="Lora"/>
+                <w:sz w:val="24"/>
+                <w:szCs w:val="28"/>
+              </w:rPr>
+            </w:pPr>
+            <w:r>
+              <w:rPr>
+                <w:rFonts w:ascii="Lora" w:hAnsi="Lora"/>
+                <w:b/>
+                <w:sz w:val="24"/>
+                <w:szCs w:val="28"/>
+              </w:rPr>
+              <w:t>Git / Web / Markdown link</w:t>
+            </w:r>
+          </w:p>
+        </w:tc>
+        <w:tc>
+          <w:tcPr>
+            <w:tcW w:w="4968" w:type="dxa"/>
+          </w:tcPr>
+          <w:p>
+            <w:pPr>
+              <w:rPr>
+                <w:rFonts w:ascii="Lora" w:hAnsi="Lora"/>
+                <w:sz w:val="24"/>
+                <w:szCs w:val="28"/>
+              </w:rPr>
+            </w:pPr>
+            <w:r>
+              <w:rPr>
+                <w:rFonts w:ascii="Lora" w:hAnsi="Lora"/>
+                <w:sz w:val="24"/>
+                <w:szCs w:val="28"/>
+              </w:rPr>
+              <w:t>[Paste repository, deployed web page, or relevant .md link here]</w:t>
+            </w:r>
+          </w:p>
+          <w:p>
+            <w:pPr>
+              <w:rPr>
+                <w:rFonts w:ascii="Lora" w:hAnsi="Lora"/>
+                <w:sz w:val="24"/>
+                <w:szCs w:val="28"/>
+              </w:rPr>
+            </w:pPr>
+            <w:hyperlink r:id="rId8" w:history="1">
+              <w:hyperlink r:id="rId9" w:history="1">
+                <w:r>
+                  <w:rPr>
+                    <w:rStyle w:val="Hyperlink"/>
+                    <w:rFonts w:ascii="Lora" w:hAnsi="Lora"/>
+                    <w:sz w:val="24"/>
+                    <w:szCs w:val="28"/>
+                  </w:rPr>
+                  <w:t>Lab 1 - Web Application Development 2026/index.html</w:t>
+                </w:r>
+              </w:hyperlink>
+            </w:hyperlink>
+          </w:p>
+        </w:tc>
+      </w:tr>
+      <w:tr>
+        <w:tc>
+          <w:tcPr>
+            <w:tcW w:w="4968" w:type="dxa"/>
+          </w:tcPr>
+          <w:p>
+            <w:pPr>
+              <w:rPr>
+                <w:rFonts w:ascii="Lora" w:hAnsi="Lora"/>
+                <w:sz w:val="24"/>
+                <w:szCs w:val="28"/>
+              </w:rPr>
+            </w:pPr>
+            <w:r>
+              <w:rPr>
+                <w:rFonts w:ascii="Lora" w:hAnsi="Lora"/>
+                <w:b/>
+                <w:sz w:val="24"/>
+                <w:szCs w:val="28"/>
+              </w:rPr>
+              <w:t>AI agent link</w:t>
+            </w:r>
+          </w:p>
+        </w:tc>
+        <w:tc>
+          <w:tcPr>
+            <w:tcW w:w="4968" w:type="dxa"/>
+          </w:tcPr>
+          <w:p>
+            <w:pPr>
+              <w:rPr>
+                <w:rFonts w:ascii="Lora" w:hAnsi="Lora"/>
+                <w:sz w:val="24"/>
+                <w:szCs w:val="28"/>
+              </w:rPr>
+            </w:pPr>
+            <w:r>
+              <w:rPr>
+                <w:rFonts w:ascii="Lora" w:hAnsi="Lora"/>
+                <w:sz w:val="24"/>
+                <w:szCs w:val="28"/>
+              </w:rPr>
+              <w:t>[Paste AI-agent / conversation / shared workspace link here]</w:t>
+            </w:r>
+          </w:p>
+          <w:p>
+            <w:pPr>
+              <w:rPr>
+                <w:rFonts w:ascii="Lora" w:hAnsi="Lora"/>
+                <w:sz w:val="24"/>
+                <w:szCs w:val="28"/>
+              </w:rPr>
+            </w:pPr>
+            <w:r>
+              <w:rPr>
+                <w:rFonts w:ascii="Lora" w:hAnsi="Lora"/>
+                <w:sz w:val="24"/>
+                <w:szCs w:val="28"/>
+              </w:rPr>
+              <w:t>[</w:t>
+            </w:r>
+            <w:hyperlink r:id="rId10" w:history="1">
+              <w:r>
+                <w:rPr>
+                  <w:rStyle w:val="Hyperlink"/>
+                  <w:rFonts w:ascii="Lora" w:hAnsi="Lora"/>
+                  <w:sz w:val="24"/>
+                  <w:szCs w:val="28"/>
+                </w:rPr>
+                <w:t>Gemini Notebook</w:t>
+              </w:r>
+            </w:hyperlink>
+            <w:r>
+              <w:rPr>
+                <w:rFonts w:ascii="Lora" w:hAnsi="Lora"/>
+                <w:sz w:val="24"/>
+                <w:szCs w:val="28"/>
+              </w:rPr>
+              <w:t>]</w:t>
+            </w:r>
+          </w:p>
+          <w:p>
+            <w:pPr>
+              <w:rPr>
+                <w:rFonts w:ascii="Lora" w:hAnsi="Lora"/>
+                <w:sz w:val="24"/>
+                <w:szCs w:val="28"/>
+              </w:rPr>
+            </w:pPr>
+            <w:r>
+              <w:rPr>
+                <w:rFonts w:ascii="Lora" w:hAnsi="Lora"/>
+                <w:sz w:val="24"/>
+                <w:szCs w:val="28"/>
+              </w:rPr>
+              <w:t>[</w:t>
+            </w:r>
+            <w:hyperlink r:id="rId11" w:history="1">
+              <w:hyperlink r:id="rId12" w:history="1">
+                <w:r>
+                  <w:rPr>
+                    <w:rStyle w:val="Hyperlink"/>
+                    <w:rFonts w:ascii="Lora" w:hAnsi="Lora"/>
+                    <w:sz w:val="24"/>
+                    <w:szCs w:val="28"/>
+                  </w:rPr>
+                  <w:t>ChatGPT</w:t>
+                </w:r>
+              </w:hyperlink>
+            </w:hyperlink>
+            <w:r>
+              <w:rPr>
+                <w:rFonts w:ascii="Lora" w:hAnsi="Lora"/>
+                <w:sz w:val="24"/>
+                <w:szCs w:val="28"/>
+              </w:rPr>
+              <w:t>]</w:t>
+            </w:r>
+          </w:p>
+        </w:tc>
+      </w:tr>
+      <w:tr>
+        <w:tc>
+          <w:tcPr>
+            <w:tcW w:w="4968" w:type="dxa"/>
+          </w:tcPr>
+          <w:p>
+            <w:pPr>
+              <w:rPr>
+                <w:rFonts w:ascii="Lora" w:hAnsi="Lora"/>
+                <w:sz w:val="24"/>
+                <w:szCs w:val="28"/>
+              </w:rPr>
+            </w:pPr>
+            <w:r>
+              <w:rPr>
+                <w:rFonts w:ascii="Lora" w:hAnsi="Lora"/>
+                <w:b/>
+                <w:sz w:val="24"/>
+                <w:szCs w:val="28"/>
+              </w:rPr>
+              <w:t>Result screenshots</w:t>
+            </w:r>
+          </w:p>
+        </w:tc>
+        <w:tc>
+          <w:tcPr>
+            <w:tcW w:w="4968" w:type="dxa"/>
+          </w:tcPr>
+          <w:p>
+            <w:pPr>
+              <w:rPr>
+                <w:rFonts w:ascii="Lora" w:hAnsi="Lora"/>
+                <w:sz w:val="24"/>
+                <w:szCs w:val="28"/>
+              </w:rPr>
+            </w:pPr>
+            <w:r>
+              <w:rPr>
+                <w:rFonts w:ascii="Lora" w:hAnsi="Lora"/>
+                <w:sz w:val="24"/>
+                <w:szCs w:val="28"/>
+              </w:rPr>
+              <w:t>[Insert screenshots below this section]</w:t>
+            </w:r>
+          </w:p>
+        </w:tc>
+      </w:tr>
+    </w:tbl>
+    <w:p>
+      <w:pPr>
+        <w:pStyle w:val="Heading2"/>
+        <w:rPr>
+          <w:rFonts w:ascii="Lora" w:hAnsi="Lora"/>
+          <w:sz w:val="32"/>
+          <w:szCs w:val="32"/>
+        </w:rPr>
+      </w:pPr>
+      <w:r>
+        <w:rPr>
+          <w:rFonts w:ascii="Lora" w:hAnsi="Lora"/>
+          <w:sz w:val="32"/>
+          <w:szCs w:val="32"/>
+        </w:rPr>
+        <w:lastRenderedPageBreak/>
+        <w:t>1.2 AI Agent</w:t>
+      </w:r>
+    </w:p>
+    <w:p>
+      <w:pPr>
+        <w:rPr>
+          <w:rFonts w:ascii="Lora" w:hAnsi="Lora"/>
+          <w:sz w:val="24"/>
+          <w:szCs w:val="28"/>
+        </w:rPr>
+      </w:pPr>
+      <w:r>
+        <w:rPr>
+          <w:rFonts w:ascii="Lora" w:hAnsi="Lora"/>
+          <w:sz w:val="24"/>
+          <w:szCs w:val="28"/>
+        </w:rPr>
+        <w:t>AI workflow evidence: show the isolated prompt used for Task T-01 and the resulting code review. The lab emphasizes decomposition before prompting and verification after generation.</w:t>
+      </w:r>
+    </w:p>
+    <w:p>
+      <w:pPr>
+        <w:rPr>
+          <w:rFonts w:ascii="Lora" w:hAnsi="Lora"/>
+          <w:sz w:val="24"/>
+          <w:szCs w:val="28"/>
+        </w:rPr>
+      </w:pPr>
+      <w:r>
+        <w:rPr>
+          <w:rFonts w:ascii="Lora" w:hAnsi="Lora"/>
+          <w:sz w:val="24"/>
+          <w:szCs w:val="28"/>
+        </w:rPr>
+        <w:t>[Paste AI-agent link here]</w:t>
+      </w:r>
+    </w:p>
+    <w:p>
+      <w:pPr>
+        <w:pStyle w:val="Heading2"/>
+        <w:rPr>
+          <w:rFonts w:ascii="Lora" w:hAnsi="Lora"/>
+          <w:sz w:val="32"/>
+          <w:szCs w:val="32"/>
+        </w:rPr>
+      </w:pPr>
+      <w:r>
+        <w:rPr>
+          <w:rFonts w:ascii="Lora" w:hAnsi="Lora"/>
+          <w:sz w:val="32"/>
+          <w:szCs w:val="32"/>
+        </w:rPr>
+        <w:t>1.3 Result Screenshots</w:t>
+      </w:r>
+    </w:p>
+    <w:p>
+      <w:pPr>
+        <w:rPr>
+          <w:rFonts w:ascii="Lora" w:hAnsi="Lora"/>
+          <w:sz w:val="24"/>
+          <w:szCs w:val="28"/>
+        </w:rPr>
+      </w:pPr>
+      <w:r>
+        <w:rPr>
+          <w:rFonts w:ascii="Lora" w:hAnsi="Lora"/>
+          <w:sz w:val="24"/>
+          <w:szCs w:val="28"/>
+        </w:rPr>
+        <w:t xml:space="preserve">Screenshot </w:t>
+      </w:r>
+      <w:r>
+        <w:rPr>
+          <w:rFonts w:ascii="Lora" w:hAnsi="Lora"/>
+          <w:sz w:val="24"/>
+          <w:szCs w:val="28"/>
+        </w:rPr>
+        <w:t>1</w:t>
+      </w:r>
+      <w:r>
+        <w:rPr>
+          <w:rFonts w:ascii="Lora" w:hAnsi="Lora"/>
+          <w:sz w:val="24"/>
+          <w:szCs w:val="28"/>
+        </w:rPr>
+        <w:t xml:space="preserve"> </w:t>
+      </w:r>
+      <w:r>
+        <w:rPr>
+          <w:rFonts w:ascii="Lora" w:hAnsi="Lora"/>
+          <w:sz w:val="24"/>
+          <w:szCs w:val="28"/>
+        </w:rPr>
+        <w:t>-</w:t>
+      </w:r>
+      <w:r>
+        <w:rPr>
+          <w:rFonts w:ascii="Lora" w:hAnsi="Lora"/>
+          <w:sz w:val="24"/>
+          <w:szCs w:val="28"/>
+        </w:rPr>
+        <w:t xml:space="preserve"> </w:t>
+      </w:r>
+      <w:r>
+        <w:rPr>
+          <w:rFonts w:ascii="Lora" w:hAnsi="Lora"/>
+          <w:sz w:val="24"/>
+          <w:szCs w:val="28"/>
+        </w:rPr>
+        <w:t>Semantic HTML / rendered page</w:t>
+      </w:r>
+    </w:p>
+    <w:p>
+      <w:pPr>
+        <w:rPr>
+          <w:rFonts w:ascii="Lora" w:hAnsi="Lora"/>
+          <w:sz w:val="24"/>
+          <w:szCs w:val="28"/>
+        </w:rPr>
+      </w:pPr>
+      <w:r>
+        <w:rPr>
+          <w:rFonts w:ascii="Lora" w:hAnsi="Lora"/>
+          <w:sz w:val="24"/>
+          <w:szCs w:val="28"/>
+        </w:rPr>
+        <w:t>[Insert screenshot here]</w:t>
+      </w:r>
+    </w:p>
+    <w:p>
+      <w:pPr>
+        <w:rPr>
+          <w:rFonts w:ascii="Lora" w:hAnsi="Lora"/>
+          <w:sz w:val="24"/>
+          <w:szCs w:val="28"/>
+        </w:rPr>
+      </w:pPr>
+      <w:r>
+        <w:rPr>
+          <w:rFonts w:ascii="Lora" w:hAnsi="Lora"/>
+          <w:sz w:val="24"/>
+          <w:szCs w:val="28"/>
+        </w:rPr>
+        <w:drawing>
+          <wp:inline distT="0" distB="0" distL="0" distR="0" wp14:anchorId="3203AB06" wp14:editId="132C02D3">
+            <wp:extent cx="6097270" cy="3143250"/>
+            <wp:effectExtent l="0" t="0" r="0" b="0"/>
+            <wp:docPr id="522116879" name="Picture 1"/>
+            <wp:cNvGraphicFramePr>
+              <a:graphicFrameLocks xmlns:a="http://schemas.openxmlformats.org/drawingml/2006/main" noChangeAspect="1"/>
+            </wp:cNvGraphicFramePr>
+            <a:graphic xmlns:a="http://schemas.openxmlformats.org/drawingml/2006/main">
+              <a:graphicData uri="http://schemas.openxmlformats.org/drawingml/2006/picture">
+                <pic:pic xmlns:pic="http://schemas.openxmlformats.org/drawingml/2006/picture">
+                  <pic:nvPicPr>
+                    <pic:cNvPr id="522116879" name=""/>
+                    <pic:cNvPicPr/>
+                  </pic:nvPicPr>
+                  <pic:blipFill>
+                    <a:blip r:embed="rId13"/>
+                    <a:stretch>
+                      <a:fillRect/>
+                    </a:stretch>
+                  </pic:blipFill>
+                  <pic:spPr>
+                    <a:xfrm>
+                      <a:off x="0" y="0"/>
+                      <a:ext cx="6097270" cy="3143250"/>
+                    </a:xfrm>
+                    <a:prstGeom prst="rect">
+                      <a:avLst/>
+                    </a:prstGeom>
+                  </pic:spPr>
+                </pic:pic>
+              </a:graphicData>
+            </a:graphic>
+          </wp:inline>
+        </w:drawing>
+      </w:r>
+    </w:p>
+    <w:p>
+      <w:pPr>
+        <w:rPr>
+          <w:rFonts w:ascii="Lora" w:hAnsi="Lora"/>
+          <w:sz w:val="24"/>
+          <w:szCs w:val="28"/>
+        </w:rPr>
+      </w:pPr>
+      <w:r>
+        <w:rPr>
+          <w:rFonts w:ascii="Lora" w:hAnsi="Lora"/>
+          <w:sz w:val="24"/>
+          <w:szCs w:val="28"/>
+        </w:rPr>
+        <w:t xml:space="preserve">Screenshot </w:t>
+      </w:r>
+      <w:r>
+        <w:rPr>
+          <w:rFonts w:ascii="Lora" w:hAnsi="Lora"/>
+          <w:sz w:val="24"/>
+          <w:szCs w:val="28"/>
+        </w:rPr>
+        <w:t>2</w:t>
+      </w:r>
+      <w:r>
+        <w:rPr>
+          <w:rFonts w:ascii="Lora" w:hAnsi="Lora"/>
+          <w:sz w:val="24"/>
+          <w:szCs w:val="28"/>
+        </w:rPr>
+        <w:t xml:space="preserve"> - </w:t>
+      </w:r>
+      <w:r>
+        <w:rPr>
+          <w:rFonts w:ascii="Lora" w:hAnsi="Lora"/>
+          <w:sz w:val="24"/>
+          <w:szCs w:val="28"/>
+        </w:rPr>
+        <w:t xml:space="preserve">Chrome DevTools Accessibility </w:t>
+      </w:r>
+      <w:r>
+        <w:rPr>
+          <w:rFonts w:ascii="Times New Roman" w:hAnsi="Times New Roman" w:cs="Times New Roman"/>
+          <w:sz w:val="24"/>
+          <w:szCs w:val="28"/>
+        </w:rPr>
+        <w:t>→</w:t>
+      </w:r>
+      <w:r>
+        <w:rPr>
+          <w:rFonts w:ascii="Lora" w:hAnsi="Lora"/>
+          <w:sz w:val="24"/>
+          <w:szCs w:val="28"/>
+        </w:rPr>
+        <w:t xml:space="preserve"> Landmark Tree</w:t>
+      </w:r>
+    </w:p>
+    <w:p>
+      <w:pPr>
+        <w:rPr>
+          <w:rFonts w:ascii="Lora" w:hAnsi="Lora"/>
+          <w:sz w:val="24"/>
+          <w:szCs w:val="28"/>
+        </w:rPr>
+      </w:pPr>
+      <w:r>
+        <w:rPr>
+          <w:rFonts w:ascii="Lora" w:hAnsi="Lora"/>
+          <w:sz w:val="24"/>
+          <w:szCs w:val="28"/>
+        </w:rPr>
+        <w:drawing>
+          <wp:inline distT="0" distB="0" distL="0" distR="0" wp14:anchorId="16AF7AF5" wp14:editId="415A4C22">
+            <wp:extent cx="6097270" cy="3154680"/>
+            <wp:effectExtent l="0" t="0" r="0" b="7620"/>
+            <wp:docPr id="1279539023" name="Picture 1"/>
+            <wp:cNvGraphicFramePr>
+              <a:graphicFrameLocks xmlns:a="http://schemas.openxmlformats.org/drawingml/2006/main" noChangeAspect="1"/>
+            </wp:cNvGraphicFramePr>
+            <a:graphic xmlns:a="http://schemas.openxmlformats.org/drawingml/2006/main">
+              <a:graphicData uri="http://schemas.openxmlformats.org/drawingml/2006/picture">
+                <pic:pic xmlns:pic="http://schemas.openxmlformats.org/drawingml/2006/picture">
+                  <pic:nvPicPr>
+                    <pic:cNvPr id="1279539023" name=""/>
+                    <pic:cNvPicPr/>
+                  </pic:nvPicPr>
+                  <pic:blipFill>
+                    <a:blip r:embed="rId14"/>
+                    <a:stretch>
+                      <a:fillRect/>
+                    </a:stretch>
+                  </pic:blipFill>
+                  <pic:spPr>
+                    <a:xfrm>
+                      <a:off x="0" y="0"/>
+                      <a:ext cx="6097270" cy="3154680"/>
+                    </a:xfrm>
+                    <a:prstGeom prst="rect">
+                      <a:avLst/>
+                    </a:prstGeom>
+                  </pic:spPr>
+                </pic:pic>
+              </a:graphicData>
+            </a:graphic>
+          </wp:inline>
+        </w:drawing>
+      </w:r>
+    </w:p>
+    <w:p>
+      <w:pPr>
+        <w:rPr>
+          <w:rFonts w:ascii="Lora" w:hAnsi="Lora"/>
+          <w:sz w:val="24"/>
+          <w:szCs w:val="28"/>
+        </w:rPr>
+      </w:pPr>
+      <w:r>
+        <w:rPr>
+          <w:rFonts w:ascii="Lora" w:hAnsi="Lora"/>
+          <w:sz w:val="24"/>
+          <w:szCs w:val="28"/>
+        </w:rPr>
+        <w:lastRenderedPageBreak/>
+        <w:t xml:space="preserve">Screenshot 3 </w:t>
+      </w:r>
+      <w:r>
+        <w:rPr>
+          <w:rFonts w:ascii="Lora" w:hAnsi="Lora"/>
+          <w:sz w:val="24"/>
+          <w:szCs w:val="28"/>
+        </w:rPr>
+        <w:t>-</w:t>
+      </w:r>
+      <w:r>
+        <w:rPr>
+          <w:rFonts w:ascii="Lora" w:hAnsi="Lora"/>
+          <w:sz w:val="24"/>
+          <w:szCs w:val="28"/>
+        </w:rPr>
+        <w:t xml:space="preserve"> Git diff / atomic commit</w:t>
+      </w:r>
+    </w:p>
+    <w:p>
+      <w:pPr>
+        <w:rPr>
+          <w:rFonts w:ascii="Lora" w:hAnsi="Lora"/>
+          <w:sz w:val="24"/>
+          <w:szCs w:val="28"/>
+        </w:rPr>
+      </w:pPr>
+      <w:r>
+        <w:rPr>
+          <w:rFonts w:ascii="Lora" w:hAnsi="Lora"/>
+          <w:sz w:val="24"/>
+          <w:szCs w:val="28"/>
+        </w:rPr>
+        <w:t>[Insert screenshot here]</w:t>
+      </w:r>
+    </w:p>
+    <w:p>
+      <w:pPr>
+        <w:rPr>
+          <w:rFonts w:ascii="Lora" w:hAnsi="Lora"/>
+          <w:sz w:val="24"/>
+          <w:szCs w:val="28"/>
+        </w:rPr>
+      </w:pPr>
+      <w:r>
+        <w:rPr>
+          <w:rFonts w:ascii="Lora" w:hAnsi="Lora"/>
+          <w:sz w:val="24"/>
+          <w:szCs w:val="28"/>
+        </w:rPr>
+        <w:drawing>
+          <wp:inline distT="0" distB="0" distL="0" distR="0" wp14:anchorId="3EAE4786" wp14:editId="3A12F0CC">
+            <wp:extent cx="6097270" cy="5140325"/>
+            <wp:effectExtent l="0" t="0" r="0" b="3175"/>
+            <wp:docPr id="1667389523" name="Picture 1"/>
+            <wp:cNvGraphicFramePr>
+              <a:graphicFrameLocks xmlns:a="http://schemas.openxmlformats.org/drawingml/2006/main" noChangeAspect="1"/>
+            </wp:cNvGraphicFramePr>
+            <a:graphic xmlns:a="http://schemas.openxmlformats.org/drawingml/2006/main">
+              <a:graphicData uri="http://schemas.openxmlformats.org/drawingml/2006/picture">
+                <pic:pic xmlns:pic="http://schemas.openxmlformats.org/drawingml/2006/picture">
+                  <pic:nvPicPr>
+                    <pic:cNvPr id="1667389523" name=""/>
+                    <pic:cNvPicPr/>
+                  </pic:nvPicPr>
+                  <pic:blipFill>
+                    <a:blip r:embed="rId15"/>
+                    <a:stretch>
+                      <a:fillRect/>
+                    </a:stretch>
+                  </pic:blipFill>
+                  <pic:spPr>
+                    <a:xfrm>
+                      <a:off x="0" y="0"/>
+                      <a:ext cx="6097270" cy="5140325"/>
+                    </a:xfrm>
+                    <a:prstGeom prst="rect">
+                      <a:avLst/>
+                    </a:prstGeom>
+                  </pic:spPr>
+                </pic:pic>
+              </a:graphicData>
+            </a:graphic>
+          </wp:inline>
+        </w:drawing>
+      </w:r>
+    </w:p>
+    <w:p>
+      <w:pPr>
+        <w:rPr>
+          <w:rFonts w:ascii="Lora" w:hAnsi="Lora"/>
+          <w:sz w:val="24"/>
+          <w:szCs w:val="28"/>
+        </w:rPr>
+      </w:pPr>
+    </w:p>
+    <w:p>
+      <w:pPr>
+        <w:rPr>
+          <w:rFonts w:ascii="Lora" w:hAnsi="Lora"/>
+          <w:sz w:val="24"/>
+          <w:szCs w:val="28"/>
+        </w:rPr>
+      </w:pPr>
+      <w:r>
+        <w:rPr>
+          <w:rFonts w:ascii="Lora" w:hAnsi="Lora"/>
+          <w:sz w:val="24"/>
+          <w:szCs w:val="28"/>
+        </w:rPr>
+        <w:lastRenderedPageBreak/>
+        <w:drawing>
+          <wp:inline distT="0" distB="0" distL="0" distR="0" wp14:anchorId="2E9F2386" wp14:editId="39AF5043">
+            <wp:extent cx="6097270" cy="3156585"/>
+            <wp:effectExtent l="0" t="0" r="0" b="5715"/>
+            <wp:docPr id="367368655" name="Picture 1"/>
+            <wp:cNvGraphicFramePr>
+              <a:graphicFrameLocks xmlns:a="http://schemas.openxmlformats.org/drawingml/2006/main" noChangeAspect="1"/>
+            </wp:cNvGraphicFramePr>
+            <a:graphic xmlns:a="http://schemas.openxmlformats.org/drawingml/2006/main">
+              <a:graphicData uri="http://schemas.openxmlformats.org/drawingml/2006/picture">
+                <pic:pic xmlns:pic="http://schemas.openxmlformats.org/drawingml/2006/picture">
+                  <pic:nvPicPr>
+                    <pic:cNvPr id="367368655" name=""/>
+                    <pic:cNvPicPr/>
+                  </pic:nvPicPr>
+                  <pic:blipFill>
+                    <a:blip r:embed="rId16"/>
+                    <a:stretch>
+                      <a:fillRect/>
+                    </a:stretch>
+                  </pic:blipFill>
+                  <pic:spPr>
+                    <a:xfrm>
+                      <a:off x="0" y="0"/>
+                      <a:ext cx="6097270" cy="3156585"/>
+                    </a:xfrm>
+                    <a:prstGeom prst="rect">
+                      <a:avLst/>
+                    </a:prstGeom>
+                  </pic:spPr>
+                </pic:pic>
+              </a:graphicData>
+            </a:graphic>
+          </wp:inline>
+        </w:drawing>
+      </w:r>
+    </w:p>
+    <w:p>
+      <w:pPr>
+        <w:rPr>
+          <w:rFonts w:ascii="Lora" w:hAnsi="Lora"/>
+          <w:sz w:val="24"/>
+          <w:szCs w:val="28"/>
+        </w:rPr>
+      </w:pPr>
+      <w:r>
+        <w:rPr>
+          <w:rFonts w:ascii="Lora" w:hAnsi="Lora"/>
+          <w:sz w:val="24"/>
+          <w:szCs w:val="28"/>
+        </w:rPr>
+        <w:drawing>
+          <wp:inline distT="0" distB="0" distL="0" distR="0" wp14:anchorId="1941A94E" wp14:editId="132100B7">
+            <wp:extent cx="6097270" cy="3239135"/>
+            <wp:effectExtent l="0" t="0" r="0" b="0"/>
+            <wp:docPr id="1991445502" name="Picture 1"/>
+            <wp:cNvGraphicFramePr>
+              <a:graphicFrameLocks xmlns:a="http://schemas.openxmlformats.org/drawingml/2006/main" noChangeAspect="1"/>
+            </wp:cNvGraphicFramePr>
+            <a:graphic xmlns:a="http://schemas.openxmlformats.org/drawingml/2006/main">
+              <a:graphicData uri="http://schemas.openxmlformats.org/drawingml/2006/picture">
+                <pic:pic xmlns:pic="http://schemas.openxmlformats.org/drawingml/2006/picture">
+                  <pic:nvPicPr>
+                    <pic:cNvPr id="1991445502" name=""/>
+                    <pic:cNvPicPr/>
+                  </pic:nvPicPr>
+                  <pic:blipFill>
+                    <a:blip r:embed="rId17"/>
+                    <a:stretch>
+                      <a:fillRect/>
+                    </a:stretch>
+                  </pic:blipFill>
+                  <pic:spPr>
+                    <a:xfrm>
+                      <a:off x="0" y="0"/>
+                      <a:ext cx="6097270" cy="3239135"/>
+                    </a:xfrm>
+                    <a:prstGeom prst="rect">
+                      <a:avLst/>
+                    </a:prstGeom>
+                  </pic:spPr>
+                </pic:pic>
+              </a:graphicData>
+            </a:graphic>
+          </wp:inline>
+        </w:drawing>
+      </w:r>
+    </w:p>
+    <w:p>
+      <w:pPr>
+        <w:rPr>
+          <w:rFonts w:ascii="Lora" w:hAnsi="Lora"/>
+          <w:sz w:val="24"/>
+          <w:szCs w:val="28"/>
+        </w:rPr>
+      </w:pPr>
+    </w:p>
+    <w:p>
+      <w:pPr>
+        <w:pStyle w:val="Heading1"/>
+        <w:rPr>
+          <w:rFonts w:ascii="Lora" w:hAnsi="Lora"/>
+          <w:sz w:val="40"/>
+          <w:szCs w:val="36"/>
+        </w:rPr>
+      </w:pPr>
+      <w:r>
+        <w:rPr>
+          <w:rFonts w:ascii="Lora" w:hAnsi="Lora"/>
+          <w:sz w:val="40"/>
+          <w:szCs w:val="36"/>
+        </w:rPr>
+        <w:t xml:space="preserve">Exercise 2 </w:t>
+      </w:r>
+      <w:r>
+        <w:rPr>
+          <w:rFonts w:ascii="Lora" w:hAnsi="Lora"/>
+          <w:sz w:val="40"/>
+          <w:szCs w:val="36"/>
+        </w:rPr>
+        <w:t>-</w:t>
+      </w:r>
+      <w:r>
+        <w:rPr>
+          <w:rFonts w:ascii="Lora" w:hAnsi="Lora"/>
+          <w:sz w:val="40"/>
+          <w:szCs w:val="36"/>
+        </w:rPr>
+        <w:t xml:space="preserve"> Enterprise Developer Portfolio</w:t>
+      </w:r>
+    </w:p>
+    <w:p>
+      <w:pPr>
+        <w:rPr>
+          <w:rFonts w:ascii="Lora" w:hAnsi="Lora"/>
+          <w:sz w:val="24"/>
+          <w:szCs w:val="28"/>
+        </w:rPr>
+      </w:pPr>
+      <w:r>
+        <w:rPr>
+          <w:rFonts w:ascii="Lora" w:hAnsi="Lora"/>
+          <w:sz w:val="24"/>
+          <w:szCs w:val="28"/>
+        </w:rPr>
+        <w:t>Objective: Develop a responsive portfolio through decomposed CSS and JavaScript milestones. The required architecture includes design tokens and reset, a responsive 2D Grid layout, an accessible theme switcher, and contract-first state persistence using localStorage key 'theme'. Acceptance criteria include 375px responsiveness, WCAG 2.2 AA contrast, keyboard navigation, and zero console errors during theme toggling.</w:t>
+      </w:r>
+    </w:p>
+    <w:p>
+      <w:pPr>
+        <w:pStyle w:val="Heading2"/>
+        <w:rPr>
+          <w:rFonts w:ascii="Lora" w:hAnsi="Lora"/>
+          <w:sz w:val="32"/>
+          <w:szCs w:val="32"/>
+        </w:rPr>
+      </w:pPr>
+      <w:r>
+        <w:rPr>
+          <w:rFonts w:ascii="Lora" w:hAnsi="Lora"/>
+          <w:sz w:val="32"/>
+          <w:szCs w:val="32"/>
+        </w:rPr>
+        <w:lastRenderedPageBreak/>
+        <w:t>2.1 Git / Web / Markdown</w:t>
+      </w:r>
+    </w:p>
+    <w:tbl>
+      <w:tblPr>
+        <w:tblStyle w:val="TableGrid"/>
+        <w:tblW w:w="0" w:type="auto"/>
+        <w:tblLook w:val="04A0" w:firstRow="1" w:lastRow="0" w:firstColumn="1" w:lastColumn="0" w:noHBand="0" w:noVBand="1"/>
+      </w:tblPr>
+      <w:tblGrid>
         <w:gridCol w:w="4908"/>
         <w:gridCol w:w="4910"/>
       </w:tblGrid>
@@ -482,6 +1327,15 @@
               </w:rPr>
               <w:t>[Paste repository, deployed web page, or relevant .md link here]</w:t>
             </w:r>
+          </w:p>
+          <w:p>
+            <w:pPr>
+              <w:rPr>
+                <w:rFonts w:ascii="Lora" w:hAnsi="Lora"/>
+                <w:sz w:val="24"/>
+                <w:szCs w:val="28"/>
+              </w:rPr>
+            </w:pPr>
           </w:p>
         </w:tc>
       </w:tr>
@@ -595,7 +1449,7 @@
           <w:sz w:val="32"/>
           <w:szCs w:val="32"/>
         </w:rPr>
-        <w:t>1.2 AI Agent</w:t>
+        <w:t>2.2 AI Agent</w:t>
       </w:r>
     </w:p>
     <w:p>
@@ -612,7 +1466,7 @@
           <w:sz w:val="24"/>
           <w:szCs w:val="28"/>
         </w:rPr>
-        <w:t>AI workflow evidence: show the isolated prompt used for Task T-01 and the resulting code review. The lab emphasizes decomposition before prompting and verification after generation.</w:t>
+        <w:t>AI workflow evidence should show the separate prompts/milestones rather than a monolithic request. The report should include the agent link used to generate or review the implementation.</w:t>
       </w:r>
     </w:p>
     <w:p>
@@ -629,7 +1483,6 @@
           <w:sz w:val="24"/>
           <w:szCs w:val="28"/>
         </w:rPr>
-        <w:lastRenderedPageBreak/>
         <w:t>[Paste AI-agent link here]</w:t>
       </w:r>
     </w:p>
@@ -648,7 +1501,7 @@
           <w:sz w:val="32"/>
           <w:szCs w:val="32"/>
         </w:rPr>
-        <w:t>1.3 Result Screenshots</w:t>
+        <w:t>2.3 Result Screenshots</w:t>
       </w:r>
     </w:p>
     <w:p>
@@ -681,7 +1534,7 @@
           <w:sz w:val="24"/>
           <w:szCs w:val="28"/>
         </w:rPr>
-        <w:t xml:space="preserve"> Semantic HTML / rendered page</w:t>
+        <w:t xml:space="preserve"> Portfolio desktop view</w:t>
       </w:r>
     </w:p>
     <w:p>
@@ -715,6 +1568,57 @@
           <w:sz w:val="24"/>
           <w:szCs w:val="28"/>
         </w:rPr>
+        <w:drawing>
+          <wp:inline distT="0" distB="0" distL="0" distR="0" wp14:anchorId="4919E565" wp14:editId="2E057AA0">
+            <wp:extent cx="6097270" cy="3161665"/>
+            <wp:effectExtent l="0" t="0" r="0" b="635"/>
+            <wp:docPr id="1558328169" name="Picture 1"/>
+            <wp:cNvGraphicFramePr>
+              <a:graphicFrameLocks xmlns:a="http://schemas.openxmlformats.org/drawingml/2006/main" noChangeAspect="1"/>
+            </wp:cNvGraphicFramePr>
+            <a:graphic xmlns:a="http://schemas.openxmlformats.org/drawingml/2006/main">
+              <a:graphicData uri="http://schemas.openxmlformats.org/drawingml/2006/picture">
+                <pic:pic xmlns:pic="http://schemas.openxmlformats.org/drawingml/2006/picture">
+                  <pic:nvPicPr>
+                    <pic:cNvPr id="1558328169" name=""/>
+                    <pic:cNvPicPr/>
+                  </pic:nvPicPr>
+                  <pic:blipFill>
+                    <a:blip r:embed="rId18"/>
+                    <a:stretch>
+                      <a:fillRect/>
+                    </a:stretch>
+                  </pic:blipFill>
+                  <pic:spPr>
+                    <a:xfrm>
+                      <a:off x="0" y="0"/>
+                      <a:ext cx="6097270" cy="3161665"/>
+                    </a:xfrm>
+                    <a:prstGeom prst="rect">
+                      <a:avLst/>
+                    </a:prstGeom>
+                  </pic:spPr>
+                </pic:pic>
+              </a:graphicData>
+            </a:graphic>
+          </wp:inline>
+        </w:drawing>
+      </w:r>
+    </w:p>
+    <w:p>
+      <w:pPr>
+        <w:rPr>
+          <w:rFonts w:ascii="Lora" w:hAnsi="Lora"/>
+          <w:sz w:val="24"/>
+          <w:szCs w:val="28"/>
+        </w:rPr>
+      </w:pPr>
+      <w:r>
+        <w:rPr>
+          <w:rFonts w:ascii="Lora" w:hAnsi="Lora"/>
+          <w:sz w:val="24"/>
+          <w:szCs w:val="28"/>
+        </w:rPr>
         <w:t xml:space="preserve">Screenshot 2 </w:t>
       </w:r>
       <w:r>
@@ -731,23 +1635,7 @@
           <w:sz w:val="24"/>
           <w:szCs w:val="28"/>
         </w:rPr>
-        <w:t xml:space="preserve"> Chrome DevTools Accessibility </w:t>
-      </w:r>
-      <w:r>
-        <w:rPr>
-          <w:rFonts w:ascii="Times New Roman" w:hAnsi="Times New Roman" w:cs="Times New Roman"/>
-          <w:sz w:val="24"/>
-          <w:szCs w:val="28"/>
-        </w:rPr>
-        <w:t>→</w:t>
-      </w:r>
-      <w:r>
-        <w:rPr>
-          <w:rFonts w:ascii="Lora" w:hAnsi="Lora"/>
-          <w:sz w:val="24"/>
-          <w:szCs w:val="28"/>
-        </w:rPr>
-        <w:t xml:space="preserve"> Landmark Tree</w:t>
+        <w:t xml:space="preserve"> 375px mobile/responsive view</w:t>
       </w:r>
     </w:p>
     <w:p>
@@ -781,6 +1669,58 @@
           <w:sz w:val="24"/>
           <w:szCs w:val="28"/>
         </w:rPr>
+        <w:lastRenderedPageBreak/>
+        <w:drawing>
+          <wp:inline distT="0" distB="0" distL="0" distR="0" wp14:anchorId="3ECB65E0" wp14:editId="2C013FEB">
+            <wp:extent cx="6097270" cy="3154680"/>
+            <wp:effectExtent l="0" t="0" r="0" b="7620"/>
+            <wp:docPr id="1554574634" name="Picture 1"/>
+            <wp:cNvGraphicFramePr>
+              <a:graphicFrameLocks xmlns:a="http://schemas.openxmlformats.org/drawingml/2006/main" noChangeAspect="1"/>
+            </wp:cNvGraphicFramePr>
+            <a:graphic xmlns:a="http://schemas.openxmlformats.org/drawingml/2006/main">
+              <a:graphicData uri="http://schemas.openxmlformats.org/drawingml/2006/picture">
+                <pic:pic xmlns:pic="http://schemas.openxmlformats.org/drawingml/2006/picture">
+                  <pic:nvPicPr>
+                    <pic:cNvPr id="1554574634" name=""/>
+                    <pic:cNvPicPr/>
+                  </pic:nvPicPr>
+                  <pic:blipFill>
+                    <a:blip r:embed="rId19"/>
+                    <a:stretch>
+                      <a:fillRect/>
+                    </a:stretch>
+                  </pic:blipFill>
+                  <pic:spPr>
+                    <a:xfrm>
+                      <a:off x="0" y="0"/>
+                      <a:ext cx="6097270" cy="3154680"/>
+                    </a:xfrm>
+                    <a:prstGeom prst="rect">
+                      <a:avLst/>
+                    </a:prstGeom>
+                  </pic:spPr>
+                </pic:pic>
+              </a:graphicData>
+            </a:graphic>
+          </wp:inline>
+        </w:drawing>
+      </w:r>
+    </w:p>
+    <w:p>
+      <w:pPr>
+        <w:rPr>
+          <w:rFonts w:ascii="Lora" w:hAnsi="Lora"/>
+          <w:sz w:val="24"/>
+          <w:szCs w:val="28"/>
+        </w:rPr>
+      </w:pPr>
+      <w:r>
+        <w:rPr>
+          <w:rFonts w:ascii="Lora" w:hAnsi="Lora"/>
+          <w:sz w:val="24"/>
+          <w:szCs w:val="28"/>
+        </w:rPr>
         <w:t xml:space="preserve">Screenshot 3 </w:t>
       </w:r>
       <w:r>
@@ -797,7 +1737,7 @@
           <w:sz w:val="24"/>
           <w:szCs w:val="28"/>
         </w:rPr>
-        <w:t xml:space="preserve"> Git diff / atomic commit</w:t>
+        <w:t xml:space="preserve"> Dark/light theme toggle and keyboard navigation</w:t>
       </w:r>
     </w:p>
     <w:p>
@@ -819,326 +1759,35 @@
     </w:p>
     <w:p>
       <w:pPr>
-        <w:pStyle w:val="Heading1"/>
-        <w:rPr>
-          <w:rFonts w:ascii="Lora" w:hAnsi="Lora"/>
-          <w:sz w:val="40"/>
-          <w:szCs w:val="36"/>
+        <w:rPr>
+          <w:rFonts w:ascii="Lora" w:hAnsi="Lora"/>
+          <w:sz w:val="24"/>
+          <w:szCs w:val="28"/>
         </w:rPr>
       </w:pPr>
       <w:r>
         <w:rPr>
           <w:rFonts w:ascii="Lora" w:hAnsi="Lora"/>
-          <w:sz w:val="40"/>
-          <w:szCs w:val="36"/>
-        </w:rPr>
-        <w:t xml:space="preserve">Exercise 2 </w:t>
+          <w:sz w:val="24"/>
+          <w:szCs w:val="28"/>
+        </w:rPr>
+        <w:t xml:space="preserve">Screenshot 4 </w:t>
       </w:r>
       <w:r>
         <w:rPr>
           <w:rFonts w:ascii="Lora" w:hAnsi="Lora"/>
-          <w:sz w:val="40"/>
-          <w:szCs w:val="36"/>
+          <w:sz w:val="24"/>
+          <w:szCs w:val="28"/>
         </w:rPr>
         <w:t>-</w:t>
       </w:r>
       <w:r>
         <w:rPr>
           <w:rFonts w:ascii="Lora" w:hAnsi="Lora"/>
-          <w:sz w:val="40"/>
-          <w:szCs w:val="36"/>
-        </w:rPr>
-        <w:t xml:space="preserve"> Enterprise Developer Portfolio</w:t>
-      </w:r>
-    </w:p>
-    <w:p>
-      <w:pPr>
-        <w:rPr>
-          <w:rFonts w:ascii="Lora" w:hAnsi="Lora"/>
           <w:sz w:val="24"/>
           <w:szCs w:val="28"/>
         </w:rPr>
-      </w:pPr>
-      <w:r>
-        <w:rPr>
-          <w:rFonts w:ascii="Lora" w:hAnsi="Lora"/>
-          <w:sz w:val="24"/>
-          <w:szCs w:val="28"/>
-        </w:rPr>
-        <w:t>Objective: Develop a responsive portfolio through decomposed CSS and JavaScript milestones. The required architecture includes design tokens and reset, a responsive 2D Grid layout, an accessible theme switcher, and contract-first state persistence using localStorage key 'theme'. Acceptance criteria include 375px responsiveness, WCAG 2.2 AA contrast, keyboard navigation, and zero console errors during theme toggling.</w:t>
-      </w:r>
-    </w:p>
-    <w:p>
-      <w:pPr>
-        <w:pStyle w:val="Heading2"/>
-        <w:rPr>
-          <w:rFonts w:ascii="Lora" w:hAnsi="Lora"/>
-          <w:sz w:val="32"/>
-          <w:szCs w:val="32"/>
-        </w:rPr>
-      </w:pPr>
-      <w:r>
-        <w:rPr>
-          <w:rFonts w:ascii="Lora" w:hAnsi="Lora"/>
-          <w:sz w:val="32"/>
-          <w:szCs w:val="32"/>
-        </w:rPr>
-        <w:t>2.1 Git / Web / Markdown</w:t>
-      </w:r>
-    </w:p>
-    <w:tbl>
-      <w:tblPr>
-        <w:tblStyle w:val="TableGrid"/>
-        <w:tblW w:w="0" w:type="auto"/>
-        <w:tblLook w:val="04A0" w:firstRow="1" w:lastRow="0" w:firstColumn="1" w:lastColumn="0" w:noHBand="0" w:noVBand="1"/>
-      </w:tblPr>
-      <w:tblGrid>
-        <w:gridCol w:w="4908"/>
-        <w:gridCol w:w="4910"/>
-      </w:tblGrid>
-      <w:tr>
-        <w:tc>
-          <w:tcPr>
-            <w:tcW w:w="4968" w:type="dxa"/>
-          </w:tcPr>
-          <w:p>
-            <w:pPr>
-              <w:rPr>
-                <w:rFonts w:ascii="Lora" w:hAnsi="Lora"/>
-                <w:sz w:val="24"/>
-                <w:szCs w:val="28"/>
-              </w:rPr>
-            </w:pPr>
-            <w:r>
-              <w:rPr>
-                <w:rFonts w:ascii="Lora" w:hAnsi="Lora"/>
-                <w:b/>
-                <w:sz w:val="24"/>
-                <w:szCs w:val="28"/>
-              </w:rPr>
-              <w:t>Git / Web / Markdown link</w:t>
-            </w:r>
-          </w:p>
-        </w:tc>
-        <w:tc>
-          <w:tcPr>
-            <w:tcW w:w="4968" w:type="dxa"/>
-          </w:tcPr>
-          <w:p>
-            <w:pPr>
-              <w:rPr>
-                <w:rFonts w:ascii="Lora" w:hAnsi="Lora"/>
-                <w:sz w:val="24"/>
-                <w:szCs w:val="28"/>
-              </w:rPr>
-            </w:pPr>
-            <w:r>
-              <w:rPr>
-                <w:rFonts w:ascii="Lora" w:hAnsi="Lora"/>
-                <w:sz w:val="24"/>
-                <w:szCs w:val="28"/>
-              </w:rPr>
-              <w:t>[Paste repository, deployed web page, or relevant .md link here]</w:t>
-            </w:r>
-          </w:p>
-        </w:tc>
-      </w:tr>
-      <w:tr>
-        <w:tc>
-          <w:tcPr>
-            <w:tcW w:w="4968" w:type="dxa"/>
-          </w:tcPr>
-          <w:p>
-            <w:pPr>
-              <w:rPr>
-                <w:rFonts w:ascii="Lora" w:hAnsi="Lora"/>
-                <w:sz w:val="24"/>
-                <w:szCs w:val="28"/>
-              </w:rPr>
-            </w:pPr>
-            <w:r>
-              <w:rPr>
-                <w:rFonts w:ascii="Lora" w:hAnsi="Lora"/>
-                <w:b/>
-                <w:sz w:val="24"/>
-                <w:szCs w:val="28"/>
-              </w:rPr>
-              <w:t>AI agent link</w:t>
-            </w:r>
-          </w:p>
-        </w:tc>
-        <w:tc>
-          <w:tcPr>
-            <w:tcW w:w="4968" w:type="dxa"/>
-          </w:tcPr>
-          <w:p>
-            <w:pPr>
-              <w:rPr>
-                <w:rFonts w:ascii="Lora" w:hAnsi="Lora"/>
-                <w:sz w:val="24"/>
-                <w:szCs w:val="28"/>
-              </w:rPr>
-            </w:pPr>
-            <w:r>
-              <w:rPr>
-                <w:rFonts w:ascii="Lora" w:hAnsi="Lora"/>
-                <w:sz w:val="24"/>
-                <w:szCs w:val="28"/>
-              </w:rPr>
-              <w:t>[Paste AI-agent / conversation / shared workspace link here]</w:t>
-            </w:r>
-          </w:p>
-        </w:tc>
-      </w:tr>
-      <w:tr>
-        <w:tc>
-          <w:tcPr>
-            <w:tcW w:w="4968" w:type="dxa"/>
-          </w:tcPr>
-          <w:p>
-            <w:pPr>
-              <w:rPr>
-                <w:rFonts w:ascii="Lora" w:hAnsi="Lora"/>
-                <w:sz w:val="24"/>
-                <w:szCs w:val="28"/>
-              </w:rPr>
-            </w:pPr>
-            <w:r>
-              <w:rPr>
-                <w:rFonts w:ascii="Lora" w:hAnsi="Lora"/>
-                <w:b/>
-                <w:sz w:val="24"/>
-                <w:szCs w:val="28"/>
-              </w:rPr>
-              <w:t>Result screenshots</w:t>
-            </w:r>
-          </w:p>
-        </w:tc>
-        <w:tc>
-          <w:tcPr>
-            <w:tcW w:w="4968" w:type="dxa"/>
-          </w:tcPr>
-          <w:p>
-            <w:pPr>
-              <w:rPr>
-                <w:rFonts w:ascii="Lora" w:hAnsi="Lora"/>
-                <w:sz w:val="24"/>
-                <w:szCs w:val="28"/>
-              </w:rPr>
-            </w:pPr>
-            <w:r>
-              <w:rPr>
-                <w:rFonts w:ascii="Lora" w:hAnsi="Lora"/>
-                <w:sz w:val="24"/>
-                <w:szCs w:val="28"/>
-              </w:rPr>
-              <w:t>[Insert screenshots below this section]</w:t>
-            </w:r>
-          </w:p>
-        </w:tc>
-      </w:tr>
-    </w:tbl>
-    <w:p>
-      <w:pPr>
-        <w:pStyle w:val="Heading2"/>
-        <w:rPr>
-          <w:rFonts w:ascii="Lora" w:hAnsi="Lora"/>
-          <w:sz w:val="32"/>
-          <w:szCs w:val="32"/>
-        </w:rPr>
-      </w:pPr>
-      <w:r>
-        <w:rPr>
-          <w:rFonts w:ascii="Lora" w:hAnsi="Lora"/>
-          <w:sz w:val="32"/>
-          <w:szCs w:val="32"/>
-        </w:rPr>
-        <w:t>2.2 AI Agent</w:t>
-      </w:r>
-    </w:p>
-    <w:p>
-      <w:pPr>
-        <w:rPr>
-          <w:rFonts w:ascii="Lora" w:hAnsi="Lora"/>
-          <w:sz w:val="24"/>
-          <w:szCs w:val="28"/>
-        </w:rPr>
-      </w:pPr>
-      <w:r>
-        <w:rPr>
-          <w:rFonts w:ascii="Lora" w:hAnsi="Lora"/>
-          <w:sz w:val="24"/>
-          <w:szCs w:val="28"/>
-        </w:rPr>
-        <w:t>AI workflow evidence should show the separate prompts/milestones rather than a monolithic request. The report should include the agent link used to generate or review the implementation.</w:t>
-      </w:r>
-    </w:p>
-    <w:p>
-      <w:pPr>
-        <w:rPr>
-          <w:rFonts w:ascii="Lora" w:hAnsi="Lora"/>
-          <w:sz w:val="24"/>
-          <w:szCs w:val="28"/>
-        </w:rPr>
-      </w:pPr>
-      <w:r>
-        <w:rPr>
-          <w:rFonts w:ascii="Lora" w:hAnsi="Lora"/>
-          <w:sz w:val="24"/>
-          <w:szCs w:val="28"/>
-        </w:rPr>
-        <w:t>[Paste AI-agent link here]</w:t>
-      </w:r>
-    </w:p>
-    <w:p>
-      <w:pPr>
-        <w:pStyle w:val="Heading2"/>
-        <w:rPr>
-          <w:rFonts w:ascii="Lora" w:hAnsi="Lora"/>
-          <w:sz w:val="32"/>
-          <w:szCs w:val="32"/>
-        </w:rPr>
-      </w:pPr>
-      <w:r>
-        <w:rPr>
-          <w:rFonts w:ascii="Lora" w:hAnsi="Lora"/>
-          <w:sz w:val="32"/>
-          <w:szCs w:val="32"/>
-        </w:rPr>
-        <w:t>2.3 Result Screenshots</w:t>
-      </w:r>
-    </w:p>
-    <w:p>
-      <w:pPr>
-        <w:rPr>
-          <w:rFonts w:ascii="Lora" w:hAnsi="Lora"/>
-          <w:sz w:val="24"/>
-          <w:szCs w:val="28"/>
-        </w:rPr>
-      </w:pPr>
-      <w:r>
-        <w:rPr>
-          <w:rFonts w:ascii="Lora" w:hAnsi="Lora"/>
-          <w:sz w:val="24"/>
-          <w:szCs w:val="28"/>
-        </w:rPr>
-        <w:t xml:space="preserve">Screenshot 1 </w:t>
-      </w:r>
-      <w:r>
-        <w:rPr>
-          <w:rFonts w:ascii="Lora" w:hAnsi="Lora"/>
-          <w:sz w:val="24"/>
-          <w:szCs w:val="28"/>
-        </w:rPr>
-        <w:t>-</w:t>
-      </w:r>
-      <w:r>
-        <w:rPr>
-          <w:rFonts w:ascii="Lora" w:hAnsi="Lora"/>
-          <w:sz w:val="24"/>
-          <w:szCs w:val="28"/>
-        </w:rPr>
-        <w:t xml:space="preserve"> Portfolio desktop view</w:t>
+        <w:t xml:space="preserve"> DevTools console / verification evidence</w:t>
       </w:r>
     </w:p>
     <w:p>
@@ -1172,145 +1821,45 @@
           <w:sz w:val="24"/>
           <w:szCs w:val="28"/>
         </w:rPr>
-        <w:t xml:space="preserve">Screenshot 2 </w:t>
-      </w:r>
-      <w:r>
-        <w:rPr>
-          <w:rFonts w:ascii="Lora" w:hAnsi="Lora"/>
-          <w:sz w:val="24"/>
-          <w:szCs w:val="28"/>
-        </w:rPr>
-        <w:t>-</w:t>
-      </w:r>
-      <w:r>
-        <w:rPr>
-          <w:rFonts w:ascii="Lora" w:hAnsi="Lora"/>
-          <w:sz w:val="24"/>
-          <w:szCs w:val="28"/>
-        </w:rPr>
-        <w:t xml:space="preserve"> 375px mobile/responsive view</w:t>
+        <w:drawing>
+          <wp:inline distT="0" distB="0" distL="0" distR="0" wp14:anchorId="13D8DEAB" wp14:editId="2C62DCAE">
+            <wp:extent cx="6097270" cy="4034790"/>
+            <wp:effectExtent l="0" t="0" r="0" b="3810"/>
+            <wp:docPr id="349755698" name="Picture 1"/>
+            <wp:cNvGraphicFramePr>
+              <a:graphicFrameLocks xmlns:a="http://schemas.openxmlformats.org/drawingml/2006/main" noChangeAspect="1"/>
+            </wp:cNvGraphicFramePr>
+            <a:graphic xmlns:a="http://schemas.openxmlformats.org/drawingml/2006/main">
+              <a:graphicData uri="http://schemas.openxmlformats.org/drawingml/2006/picture">
+                <pic:pic xmlns:pic="http://schemas.openxmlformats.org/drawingml/2006/picture">
+                  <pic:nvPicPr>
+                    <pic:cNvPr id="349755698" name=""/>
+                    <pic:cNvPicPr/>
+                  </pic:nvPicPr>
+                  <pic:blipFill>
+                    <a:blip r:embed="rId20"/>
+                    <a:stretch>
+                      <a:fillRect/>
+                    </a:stretch>
+                  </pic:blipFill>
+                  <pic:spPr>
+                    <a:xfrm>
+                      <a:off x="0" y="0"/>
+                      <a:ext cx="6097270" cy="4034790"/>
+                    </a:xfrm>
+                    <a:prstGeom prst="rect">
+                      <a:avLst/>
+                    </a:prstGeom>
+                  </pic:spPr>
+                </pic:pic>
+              </a:graphicData>
+            </a:graphic>
+          </wp:inline>
+        </w:drawing>
       </w:r>
     </w:p>
     <w:p>
       <w:pPr>
-        <w:rPr>
-          <w:rFonts w:ascii="Lora" w:hAnsi="Lora"/>
-          <w:sz w:val="24"/>
-          <w:szCs w:val="28"/>
-        </w:rPr>
-      </w:pPr>
-      <w:r>
-        <w:rPr>
-          <w:rFonts w:ascii="Lora" w:hAnsi="Lora"/>
-          <w:sz w:val="24"/>
-          <w:szCs w:val="28"/>
-        </w:rPr>
-        <w:t>[Insert screenshot here]</w:t>
-      </w:r>
-    </w:p>
-    <w:p>
-      <w:pPr>
-        <w:rPr>
-          <w:rFonts w:ascii="Lora" w:hAnsi="Lora"/>
-          <w:sz w:val="24"/>
-          <w:szCs w:val="28"/>
-        </w:rPr>
-      </w:pPr>
-      <w:r>
-        <w:rPr>
-          <w:rFonts w:ascii="Lora" w:hAnsi="Lora"/>
-          <w:sz w:val="24"/>
-          <w:szCs w:val="28"/>
-        </w:rPr>
-        <w:lastRenderedPageBreak/>
-        <w:t xml:space="preserve">Screenshot 3 </w:t>
-      </w:r>
-      <w:r>
-        <w:rPr>
-          <w:rFonts w:ascii="Lora" w:hAnsi="Lora"/>
-          <w:sz w:val="24"/>
-          <w:szCs w:val="28"/>
-        </w:rPr>
-        <w:t>-</w:t>
-      </w:r>
-      <w:r>
-        <w:rPr>
-          <w:rFonts w:ascii="Lora" w:hAnsi="Lora"/>
-          <w:sz w:val="24"/>
-          <w:szCs w:val="28"/>
-        </w:rPr>
-        <w:t xml:space="preserve"> Dark/light theme toggle and keyboard navigation</w:t>
-      </w:r>
-    </w:p>
-    <w:p>
-      <w:pPr>
-        <w:rPr>
-          <w:rFonts w:ascii="Lora" w:hAnsi="Lora"/>
-          <w:sz w:val="24"/>
-          <w:szCs w:val="28"/>
-        </w:rPr>
-      </w:pPr>
-      <w:r>
-        <w:rPr>
-          <w:rFonts w:ascii="Lora" w:hAnsi="Lora"/>
-          <w:sz w:val="24"/>
-          <w:szCs w:val="28"/>
-        </w:rPr>
-        <w:t>[Insert screenshot here]</w:t>
-      </w:r>
-    </w:p>
-    <w:p>
-      <w:pPr>
-        <w:rPr>
-          <w:rFonts w:ascii="Lora" w:hAnsi="Lora"/>
-          <w:sz w:val="24"/>
-          <w:szCs w:val="28"/>
-        </w:rPr>
-      </w:pPr>
-      <w:r>
-        <w:rPr>
-          <w:rFonts w:ascii="Lora" w:hAnsi="Lora"/>
-          <w:sz w:val="24"/>
-          <w:szCs w:val="28"/>
-        </w:rPr>
-        <w:t xml:space="preserve">Screenshot 4 </w:t>
-      </w:r>
-      <w:r>
-        <w:rPr>
-          <w:rFonts w:ascii="Lora" w:hAnsi="Lora"/>
-          <w:sz w:val="24"/>
-          <w:szCs w:val="28"/>
-        </w:rPr>
-        <w:t>-</w:t>
-      </w:r>
-      <w:r>
-        <w:rPr>
-          <w:rFonts w:ascii="Lora" w:hAnsi="Lora"/>
-          <w:sz w:val="24"/>
-          <w:szCs w:val="28"/>
-        </w:rPr>
-        <w:t xml:space="preserve"> DevTools console / verification evidence</w:t>
-      </w:r>
-    </w:p>
-    <w:p>
-      <w:pPr>
-        <w:rPr>
-          <w:rFonts w:ascii="Lora" w:hAnsi="Lora"/>
-          <w:sz w:val="24"/>
-          <w:szCs w:val="28"/>
-        </w:rPr>
-      </w:pPr>
-      <w:r>
-        <w:rPr>
-          <w:rFonts w:ascii="Lora" w:hAnsi="Lora"/>
-          <w:sz w:val="24"/>
-          <w:szCs w:val="28"/>
-        </w:rPr>
-        <w:t>[Insert screenshot here]</w:t>
-      </w:r>
-    </w:p>
-    <w:p>
-      <w:pPr>
         <w:pStyle w:val="Heading1"/>
         <w:rPr>
           <w:rFonts w:ascii="Lora" w:hAnsi="Lora"/>
@@ -1324,6 +1873,7 @@
           <w:sz w:val="40"/>
           <w:szCs w:val="36"/>
         </w:rPr>
+        <w:lastRenderedPageBreak/>
         <w:t xml:space="preserve">Exercise 3 </w:t>
       </w:r>
       <w:r>
@@ -1815,7 +2365,6 @@
           <w:sz w:val="40"/>
           <w:szCs w:val="36"/>
         </w:rPr>
-        <w:lastRenderedPageBreak/>
         <w:t>Verification Summary</w:t>
       </w:r>
     </w:p>
@@ -1888,6 +2437,7 @@
           <w:sz w:val="24"/>
           <w:szCs w:val="28"/>
         </w:rPr>
+        <w:lastRenderedPageBreak/>
         <w:t>Performance: inspect Core Web Vitals, especially LCP, INP, and CLS where applicable.</w:t>
       </w:r>
     </w:p>
@@ -1963,7 +2513,7 @@
       </w:r>
     </w:p>
     <w:sectPr>
-      <w:footerReference w:type="default" r:id="rId8"/>
+      <w:footerReference w:type="default" r:id="rId21"/>
       <w:pgSz w:w="11906" w:h="16838" w:code="9"/>
       <w:pgMar w:top="936" w:right="1152" w:bottom="936" w:left="1152" w:header="720" w:footer="720" w:gutter="0"/>
       <w:cols w:space="720"/>
@@ -2865,7 +3415,6 @@
   <w:style w:type="character" w:default="1" w:styleId="DefaultParagraphFont">
     <w:name w:val="Default Paragraph Font"/>
     <w:uiPriority w:val="1"/>
-    <w:semiHidden/>
     <w:unhideWhenUsed/>
   </w:style>
   <w:style w:type="table" w:default="1" w:styleId="TableNormal">
@@ -13641,6 +14190,41 @@
         <w:shd w:val="clear" w:color="auto" w:fill="FBCAA2" w:themeFill="accent6" w:themeFillTint="7F"/>
       </w:tcPr>
     </w:tblStylePr>
+  </w:style>
+  <w:style w:type="character" w:styleId="Hyperlink">
+    <w:name w:val="Hyperlink"/>
+    <w:basedOn w:val="DefaultParagraphFont"/>
+    <w:uiPriority w:val="99"/>
+    <w:unhideWhenUsed/>
+    <w:rsid w:val="00841AF4"/>
+    <w:rPr>
+      <w:color w:val="0000FF" w:themeColor="hyperlink"/>
+      <w:u w:val="single"/>
+    </w:rPr>
+  </w:style>
+  <w:style w:type="character" w:styleId="UnresolvedMention">
+    <w:name w:val="Unresolved Mention"/>
+    <w:basedOn w:val="DefaultParagraphFont"/>
+    <w:uiPriority w:val="99"/>
+    <w:semiHidden/>
+    <w:unhideWhenUsed/>
+    <w:rsid w:val="00841AF4"/>
+    <w:rPr>
+      <w:color w:val="605E5C"/>
+      <w:shd w:val="clear" w:color="auto" w:fill="E1DFDD"/>
+    </w:rPr>
+  </w:style>
+  <w:style w:type="character" w:styleId="FollowedHyperlink">
+    <w:name w:val="FollowedHyperlink"/>
+    <w:basedOn w:val="DefaultParagraphFont"/>
+    <w:uiPriority w:val="99"/>
+    <w:semiHidden/>
+    <w:unhideWhenUsed/>
+    <w:rsid w:val="00841AF4"/>
+    <w:rPr>
+      <w:color w:val="800080" w:themeColor="followedHyperlink"/>
+      <w:u w:val="single"/>
+    </w:rPr>
   </w:style>
 </w:styles>
 </file>

</xml_diff>